<commit_message>
Added reference of arithmetic coding paper
</commit_message>
<xml_diff>
--- a/paper/mic-paper-simplified-ieee.docx
+++ b/paper/mic-paper-simplified-ieee.docx
@@ -30,7 +30,7 @@
         <w:rPr>
           <w:rStyle w:val="FootnoteReference"/>
         </w:rPr>
-        <w:footnoteReference w:id="9"/>
+        <w:footnoteReference w:id="20"/>
       </w:r>
     </w:p>
     <w:p>
@@ -234,7 +234,7 @@
         <w:t xml:space="preserve">imaging.</w:t>
       </w:r>
     </w:p>
-    <w:bookmarkStart w:id="16" w:name="sec:intro"/>
+    <w:bookmarkStart w:id="27" w:name="sec:intro"/>
     <w:p>
       <w:pPr>
         <w:pStyle w:val="Heading1"/>
@@ -444,7 +444,7 @@
         <w:t xml:space="preserve">and is built from the ground up for medical images.</w:t>
       </w:r>
     </w:p>
-    <w:bookmarkStart w:id="12" w:name="Xf9d516eed5f7401174fecaa086b912906a5424e"/>
+    <w:bookmarkStart w:id="23" w:name="Xf9d516eed5f7401174fecaa086b912906a5424e"/>
     <w:p>
       <w:pPr>
         <w:pStyle w:val="Heading2"/>
@@ -722,7 +722,7 @@
         <w:t xml:space="preserve">argument being the main source of the gain.</w:t>
       </w:r>
     </w:p>
-    <w:bookmarkStart w:id="11" w:name="the-residual-stream"/>
+    <w:bookmarkStart w:id="22" w:name="the-residual-stream"/>
     <w:p>
       <w:pPr>
         <w:pStyle w:val="Heading4"/>
@@ -802,9 +802,9 @@
         <w:t xml:space="preserve">well.</w:t>
       </w:r>
     </w:p>
-    <w:bookmarkEnd w:id="11"/>
-    <w:bookmarkEnd w:id="12"/>
-    <w:bookmarkStart w:id="13" w:name="what-mic-is"/>
+    <w:bookmarkEnd w:id="22"/>
+    <w:bookmarkEnd w:id="23"/>
+    <w:bookmarkStart w:id="24" w:name="what-mic-is"/>
     <w:p>
       <w:pPr>
         <w:pStyle w:val="Heading2"/>
@@ -889,8 +889,8 @@
         <w:t xml:space="preserve">once.</w:t>
       </w:r>
     </w:p>
-    <w:bookmarkEnd w:id="13"/>
-    <w:bookmarkStart w:id="15" w:name="contributions-briefly"/>
+    <w:bookmarkEnd w:id="24"/>
+    <w:bookmarkStart w:id="26" w:name="contributions-briefly"/>
     <w:p>
       <w:pPr>
         <w:pStyle w:val="Heading2"/>
@@ -1084,7 +1084,7 @@
         <w:t xml:space="preserve">client-side decoding in browsers.</w:t>
       </w:r>
     </w:p>
-    <w:bookmarkStart w:id="14" w:name="scope"/>
+    <w:bookmarkStart w:id="25" w:name="scope"/>
     <w:p>
       <w:pPr>
         <w:pStyle w:val="Heading4"/>
@@ -1113,10 +1113,10 @@
         <w:t xml:space="preserve">are out of scope.</w:t>
       </w:r>
     </w:p>
-    <w:bookmarkEnd w:id="14"/>
-    <w:bookmarkEnd w:id="15"/>
-    <w:bookmarkEnd w:id="16"/>
-    <w:bookmarkStart w:id="17" w:name="sec:related"/>
+    <w:bookmarkEnd w:id="25"/>
+    <w:bookmarkEnd w:id="26"/>
+    <w:bookmarkEnd w:id="27"/>
+    <w:bookmarkStart w:id="28" w:name="sec:related"/>
     <w:p>
       <w:pPr>
         <w:pStyle w:val="Heading1"/>
@@ -1305,13 +1305,34 @@
         <w:t xml:space="preserve">Zstandard </w:t>
       </w:r>
       <w:r>
-        <w:t xml:space="preserve">. The limitation is that these implementations are</w:t>
-      </w:r>
-      <w:r>
-        <w:t xml:space="preserve"> </w:t>
-      </w:r>
-      <w:r>
-        <w:t xml:space="preserve">tuned for byte streams (Zstandard caps FSE at 4,096 symbols).</w:t>
+        <w:t xml:space="preserve">. Coding directly over a large, multi-symbol alphabet</w:t>
+      </w:r>
+      <w:r>
+        <w:t xml:space="preserve"> </w:t>
+      </w:r>
+      <w:r>
+        <w:t xml:space="preserve">rather than a byte stream is not itself new; for example, Mahapatra and Singh</w:t>
+      </w:r>
+      <w:r>
+        <w:t xml:space="preserve"> </w:t>
+      </w:r>
+      <w:r>
+        <w:t xml:space="preserve">built a multi-alphabet arithmetic coder in FPGA hardware </w:t>
+      </w:r>
+      <w:r>
+        <w:t xml:space="preserve">.</w:t>
+      </w:r>
+      <w:r>
+        <w:t xml:space="preserve"> </w:t>
+      </w:r>
+      <w:r>
+        <w:t xml:space="preserve">The limitation is that the widely deployed software implementations are tuned</w:t>
+      </w:r>
+      <w:r>
+        <w:t xml:space="preserve"> </w:t>
+      </w:r>
+      <w:r>
+        <w:t xml:space="preserve">for byte streams (Zstandard caps FSE at 4,096 symbols).</w:t>
       </w:r>
     </w:p>
     <w:p>
@@ -1402,8 +1423,8 @@
         <w:t xml:space="preserve">dimensions relevant to medical image compression.</w:t>
       </w:r>
     </w:p>
-    <w:bookmarkEnd w:id="17"/>
-    <w:bookmarkStart w:id="26" w:name="sec:pipeline"/>
+    <w:bookmarkEnd w:id="28"/>
+    <w:bookmarkStart w:id="37" w:name="sec:pipeline"/>
     <w:p>
       <w:pPr>
         <w:pStyle w:val="Heading1"/>
@@ -1444,7 +1465,7 @@
         <w:t xml:space="preserve">(remove the remaining redundancy), producing compressed bytes.</w:t>
       </w:r>
     </w:p>
-    <w:bookmarkStart w:id="20" w:name="spatial-prediction"/>
+    <w:bookmarkStart w:id="31" w:name="spatial-prediction"/>
     <w:p>
       <w:pPr>
         <w:pStyle w:val="Heading2"/>
@@ -1520,7 +1541,7 @@
         <w:t xml:space="preserve">the decode side, and works well on medical images.</w:t>
       </w:r>
     </w:p>
-    <w:bookmarkStart w:id="19" w:name="other-predictors-we-evaluated"/>
+    <w:bookmarkStart w:id="30" w:name="other-predictors-we-evaluated"/>
     <w:p>
       <w:pPr>
         <w:pStyle w:val="Heading4"/>
@@ -1607,7 +1628,7 @@
         <w:t xml:space="preserve">summarizes the comparison.</w:t>
       </w:r>
     </w:p>
-    <w:bookmarkStart w:id="18" w:name="tab:predictor-summary"/>
+    <w:bookmarkStart w:id="29" w:name="tab:predictor-summary"/>
     <w:p>
       <w:pPr>
         <w:pStyle w:val="TableCaption"/>
@@ -1956,10 +1977,10 @@
         </w:tc>
       </w:tr>
     </w:tbl>
-    <w:bookmarkEnd w:id="18"/>
-    <w:bookmarkEnd w:id="19"/>
-    <w:bookmarkEnd w:id="20"/>
-    <w:bookmarkStart w:id="22" w:name="handling-large-jumps-overflow-coding"/>
+    <w:bookmarkEnd w:id="29"/>
+    <w:bookmarkEnd w:id="30"/>
+    <w:bookmarkEnd w:id="31"/>
+    <w:bookmarkStart w:id="33" w:name="handling-large-jumps-overflow-coding"/>
     <w:p>
       <w:pPr>
         <w:pStyle w:val="Heading2"/>
@@ -2071,7 +2092,7 @@
         <w:t xml:space="preserve">representative bit depth.</w:t>
       </w:r>
     </w:p>
-    <w:bookmarkStart w:id="21" w:name="tab:overflow-map"/>
+    <w:bookmarkStart w:id="32" w:name="tab:overflow-map"/>
     <w:p>
       <w:pPr>
         <w:pStyle w:val="TableCaption"/>
@@ -2496,9 +2517,9 @@
         </w:tc>
       </w:tr>
     </w:tbl>
-    <w:bookmarkEnd w:id="21"/>
-    <w:bookmarkEnd w:id="22"/>
-    <w:bookmarkStart w:id="23" w:name="bit-run-length-encoding-rle"/>
+    <w:bookmarkEnd w:id="32"/>
+    <w:bookmarkEnd w:id="33"/>
+    <w:bookmarkStart w:id="34" w:name="bit-run-length-encoding-rle"/>
     <w:p>
       <w:pPr>
         <w:pStyle w:val="Heading2"/>
@@ -2727,8 +2748,8 @@
         <w:t xml:space="preserve">counter, without touching the compressed data at all.</w:t>
       </w:r>
     </w:p>
-    <w:bookmarkEnd w:id="23"/>
-    <w:bookmarkStart w:id="25" w:name="X720b39608bfefa9f84f7dbbedb7393b7b6d69fb"/>
+    <w:bookmarkEnd w:id="34"/>
+    <w:bookmarkStart w:id="36" w:name="X720b39608bfefa9f84f7dbbedb7393b7b6d69fb"/>
     <w:p>
       <w:pPr>
         <w:pStyle w:val="Heading2"/>
@@ -3280,7 +3301,7 @@
         <w:t xml:space="preserve">shows the ablation across selected images.</w:t>
       </w:r>
     </w:p>
-    <w:bookmarkStart w:id="24" w:name="tab:tablelog-ablation"/>
+    <w:bookmarkStart w:id="35" w:name="tab:tablelog-ablation"/>
     <w:p>
       <w:pPr>
         <w:pStyle w:val="TableCaption"/>
@@ -3939,10 +3960,10 @@
         </w:tc>
       </w:tr>
     </w:tbl>
-    <w:bookmarkEnd w:id="24"/>
-    <w:bookmarkEnd w:id="25"/>
-    <w:bookmarkEnd w:id="26"/>
-    <w:bookmarkStart w:id="32" w:name="sec:multistate"/>
+    <w:bookmarkEnd w:id="35"/>
+    <w:bookmarkEnd w:id="36"/>
+    <w:bookmarkEnd w:id="37"/>
+    <w:bookmarkStart w:id="43" w:name="sec:multistate"/>
     <w:p>
       <w:pPr>
         <w:pStyle w:val="Heading1"/>
@@ -3951,7 +3972,7 @@
         <w:t xml:space="preserve">Faster Decoding: Multi-State Decoding</w:t>
       </w:r>
     </w:p>
-    <w:bookmarkStart w:id="27" w:name="the-bottleneck"/>
+    <w:bookmarkStart w:id="38" w:name="the-bottleneck"/>
     <w:p>
       <w:pPr>
         <w:pStyle w:val="Heading2"/>
@@ -4049,8 +4070,8 @@
         <w:t xml:space="preserve">–83% of the CPU’s capacity unused.</w:t>
       </w:r>
     </w:p>
-    <w:bookmarkEnd w:id="27"/>
-    <w:bookmarkStart w:id="28" w:name="the-approach"/>
+    <w:bookmarkEnd w:id="38"/>
+    <w:bookmarkStart w:id="39" w:name="the-approach"/>
     <w:p>
       <w:pPr>
         <w:pStyle w:val="Heading2"/>
@@ -4235,8 +4256,8 @@
         <w:t xml:space="preserve">positions.</w:t>
       </w:r>
     </w:p>
-    <w:bookmarkEnd w:id="28"/>
-    <w:bookmarkStart w:id="31" w:name="measured-speedup"/>
+    <w:bookmarkEnd w:id="39"/>
+    <w:bookmarkStart w:id="42" w:name="measured-speedup"/>
     <w:p>
       <w:pPr>
         <w:pStyle w:val="Heading2"/>
@@ -4465,7 +4486,7 @@
         <w:t xml:space="preserve">ARM64 speedup.</w:t>
       </w:r>
     </w:p>
-    <w:bookmarkStart w:id="29" w:name="tab:latency"/>
+    <w:bookmarkStart w:id="40" w:name="tab:latency"/>
     <w:p>
       <w:pPr>
         <w:pStyle w:val="TableCaption"/>
@@ -4872,7 +4893,7 @@
         </w:tc>
       </w:tr>
     </w:tbl>
-    <w:bookmarkEnd w:id="29"/>
+    <w:bookmarkEnd w:id="40"/>
     <w:p>
       <w:pPr>
         <w:pStyle w:val="BodyText"/>
@@ -4925,7 +4946,7 @@
         <w:t xml:space="preserve">on-disk layout of a single-frame stream.</w:t>
       </w:r>
     </w:p>
-    <w:bookmarkStart w:id="30" w:name="tab:format"/>
+    <w:bookmarkStart w:id="41" w:name="tab:format"/>
     <w:p>
       <w:pPr>
         <w:pStyle w:val="TableCaption"/>
@@ -5551,10 +5572,10 @@
         </w:tc>
       </w:tr>
     </w:tbl>
-    <w:bookmarkEnd w:id="30"/>
-    <w:bookmarkEnd w:id="31"/>
-    <w:bookmarkEnd w:id="32"/>
-    <w:bookmarkStart w:id="34" w:name="sec:methodology"/>
+    <w:bookmarkEnd w:id="41"/>
+    <w:bookmarkEnd w:id="42"/>
+    <w:bookmarkEnd w:id="43"/>
+    <w:bookmarkStart w:id="45" w:name="sec:methodology"/>
     <w:p>
       <w:pPr>
         <w:pStyle w:val="Heading1"/>
@@ -5631,7 +5652,7 @@
         <w:t xml:space="preserve">lists the images.</w:t>
       </w:r>
     </w:p>
-    <w:bookmarkStart w:id="33" w:name="tab:dataset"/>
+    <w:bookmarkStart w:id="44" w:name="tab:dataset"/>
     <w:p>
       <w:pPr>
         <w:pStyle w:val="TableCaption"/>
@@ -8086,7 +8107,7 @@
         </w:tc>
       </w:tr>
     </w:tbl>
-    <w:bookmarkEnd w:id="33"/>
+    <w:bookmarkEnd w:id="44"/>
     <w:p>
       <w:pPr>
         <w:pStyle w:val="BodyText"/>
@@ -8458,8 +8479,8 @@
         <w:t xml:space="preserve">ARM64 machine.</w:t>
       </w:r>
     </w:p>
-    <w:bookmarkEnd w:id="34"/>
-    <w:bookmarkStart w:id="44" w:name="sec:results"/>
+    <w:bookmarkEnd w:id="45"/>
+    <w:bookmarkStart w:id="55" w:name="sec:results"/>
     <w:p>
       <w:pPr>
         <w:pStyle w:val="Heading1"/>
@@ -8468,7 +8489,7 @@
         <w:t xml:space="preserve">Results</w:t>
       </w:r>
     </w:p>
-    <w:bookmarkStart w:id="35" w:name="compression-ratio"/>
+    <w:bookmarkStart w:id="46" w:name="compression-ratio"/>
     <w:p>
       <w:pPr>
         <w:pStyle w:val="Heading2"/>
@@ -15597,8 +15618,8 @@
         </w:tc>
       </w:tr>
     </w:tbl>
-    <w:bookmarkEnd w:id="35"/>
-    <w:bookmarkStart w:id="36" w:name="encoding-speed"/>
+    <w:bookmarkEnd w:id="46"/>
+    <w:bookmarkStart w:id="47" w:name="encoding-speed"/>
     <w:p>
       <w:pPr>
         <w:pStyle w:val="Heading2"/>
@@ -20724,8 +20745,8 @@
         </w:tc>
       </w:tr>
     </w:tbl>
-    <w:bookmarkEnd w:id="36"/>
-    <w:bookmarkStart w:id="38" w:name="decoding-speed"/>
+    <w:bookmarkEnd w:id="47"/>
+    <w:bookmarkStart w:id="49" w:name="decoding-speed"/>
     <w:p>
       <w:pPr>
         <w:pStyle w:val="Heading2"/>
@@ -25968,7 +25989,7 @@
         </w:tc>
       </w:tr>
     </w:tbl>
-    <w:bookmarkStart w:id="37" w:name="tab:fse-combined"/>
+    <w:bookmarkStart w:id="48" w:name="tab:fse-combined"/>
     <w:p>
       <w:pPr>
         <w:pStyle w:val="TableCaption"/>
@@ -27131,9 +27152,9 @@
         </w:tc>
       </w:tr>
     </w:tbl>
-    <w:bookmarkEnd w:id="37"/>
-    <w:bookmarkEnd w:id="38"/>
-    <w:bookmarkStart w:id="39" w:name="other-mic-variants-for-reference"/>
+    <w:bookmarkEnd w:id="48"/>
+    <w:bookmarkEnd w:id="49"/>
+    <w:bookmarkStart w:id="50" w:name="other-mic-variants-for-reference"/>
     <w:p>
       <w:pPr>
         <w:pStyle w:val="Heading2"/>
@@ -27252,8 +27273,8 @@
         <w:t xml:space="preserve">configuration on this dataset.</w:t>
       </w:r>
     </w:p>
-    <w:bookmarkEnd w:id="39"/>
-    <w:bookmarkStart w:id="40" w:name="multi-threaded-decoding"/>
+    <w:bookmarkEnd w:id="50"/>
+    <w:bookmarkStart w:id="51" w:name="multi-threaded-decoding"/>
     <w:p>
       <w:pPr>
         <w:pStyle w:val="Heading2"/>
@@ -32627,8 +32648,8 @@
         <w:t xml:space="preserve">machine, use strip-parallel mode with four to eight threads.</w:t>
       </w:r>
     </w:p>
-    <w:bookmarkEnd w:id="40"/>
-    <w:bookmarkStart w:id="43" w:name="in-the-browser"/>
+    <w:bookmarkEnd w:id="51"/>
+    <w:bookmarkStart w:id="54" w:name="in-the-browser"/>
     <w:p>
       <w:pPr>
         <w:pStyle w:val="Heading2"/>
@@ -32794,7 +32815,7 @@
         <w:t xml:space="preserve">give the JS numbers.</w:t>
       </w:r>
     </w:p>
-    <w:bookmarkStart w:id="41" w:name="tab:js-perf"/>
+    <w:bookmarkStart w:id="52" w:name="tab:js-perf"/>
     <w:p>
       <w:pPr>
         <w:pStyle w:val="TableCaption"/>
@@ -33739,7 +33760,7 @@
         </w:tc>
       </w:tr>
     </w:tbl>
-    <w:bookmarkEnd w:id="41"/>
+    <w:bookmarkEnd w:id="52"/>
     <w:p>
       <w:pPr>
         <w:pStyle w:val="BodyText"/>
@@ -33777,7 +33798,7 @@
         <w:t xml:space="preserve">is within run-to-run noise here.</w:t>
       </w:r>
     </w:p>
-    <w:bookmarkStart w:id="42" w:name="tab:pics-js"/>
+    <w:bookmarkStart w:id="53" w:name="tab:pics-js"/>
     <w:p>
       <w:pPr>
         <w:pStyle w:val="TableCaption"/>
@@ -34393,10 +34414,10 @@
         </w:tc>
       </w:tr>
     </w:tbl>
-    <w:bookmarkEnd w:id="42"/>
-    <w:bookmarkEnd w:id="43"/>
-    <w:bookmarkEnd w:id="44"/>
-    <w:bookmarkStart w:id="50" w:name="sec:discussion"/>
+    <w:bookmarkEnd w:id="53"/>
+    <w:bookmarkEnd w:id="54"/>
+    <w:bookmarkEnd w:id="55"/>
+    <w:bookmarkStart w:id="61" w:name="sec:discussion"/>
     <w:p>
       <w:pPr>
         <w:pStyle w:val="Heading1"/>
@@ -34405,7 +34426,7 @@
         <w:t xml:space="preserve">Discussion</w:t>
       </w:r>
     </w:p>
-    <w:bookmarkStart w:id="45" w:name="reading-the-results-together"/>
+    <w:bookmarkStart w:id="56" w:name="reading-the-results-together"/>
     <w:p>
       <w:pPr>
         <w:pStyle w:val="Heading2"/>
@@ -34520,8 +34541,8 @@
         <w:t xml:space="preserve">with HTJ2K’s vectorized block coder, and it costs nothing in file size.</w:t>
       </w:r>
     </w:p>
-    <w:bookmarkEnd w:id="45"/>
-    <w:bookmarkStart w:id="47" w:name="choosing-a-codec"/>
+    <w:bookmarkEnd w:id="56"/>
+    <w:bookmarkStart w:id="58" w:name="choosing-a-codec"/>
     <w:p>
       <w:pPr>
         <w:pStyle w:val="Heading2"/>
@@ -34802,7 +34823,7 @@
         <w:t xml:space="preserve">reports the weighted matrix.</w:t>
       </w:r>
     </w:p>
-    <w:bookmarkStart w:id="46" w:name="tab:decision-matrix"/>
+    <w:bookmarkStart w:id="57" w:name="tab:decision-matrix"/>
     <w:p>
       <w:pPr>
         <w:pStyle w:val="TableCaption"/>
@@ -35995,9 +36016,9 @@
         </w:tc>
       </w:tr>
     </w:tbl>
-    <w:bookmarkEnd w:id="46"/>
-    <w:bookmarkEnd w:id="47"/>
-    <w:bookmarkStart w:id="48" w:name="future-work"/>
+    <w:bookmarkEnd w:id="57"/>
+    <w:bookmarkEnd w:id="58"/>
+    <w:bookmarkStart w:id="59" w:name="future-work"/>
     <w:p>
       <w:pPr>
         <w:pStyle w:val="Heading2"/>
@@ -36289,8 +36310,8 @@
         <w:t xml:space="preserve">here. Adding these baselines is left to future work.</w:t>
       </w:r>
     </w:p>
-    <w:bookmarkEnd w:id="48"/>
-    <w:bookmarkStart w:id="49" w:name="adding-mic-as-a-dicom-transfer-syntax"/>
+    <w:bookmarkEnd w:id="59"/>
+    <w:bookmarkStart w:id="60" w:name="adding-mic-as-a-dicom-transfer-syntax"/>
     <w:p>
       <w:pPr>
         <w:pStyle w:val="Heading2"/>
@@ -36538,9 +36559,9 @@
         <w:t xml:space="preserve">open-source codec.</w:t>
       </w:r>
     </w:p>
-    <w:bookmarkEnd w:id="49"/>
-    <w:bookmarkEnd w:id="50"/>
-    <w:bookmarkStart w:id="60" w:name="sec:conclusion"/>
+    <w:bookmarkEnd w:id="60"/>
+    <w:bookmarkEnd w:id="61"/>
+    <w:bookmarkStart w:id="71" w:name="sec:conclusion"/>
     <w:p>
       <w:pPr>
         <w:pStyle w:val="Heading1"/>
@@ -36685,7 +36706,7 @@
       <w:r>
         <w:t xml:space="preserve"> </w:t>
       </w:r>
-      <w:hyperlink r:id="rId10">
+      <w:hyperlink r:id="rId21">
         <w:r>
           <w:rPr>
             <w:rStyle w:val="Hyperlink"/>
@@ -36727,7 +36748,7 @@
       <w:r>
         <w:t xml:space="preserve"> </w:t>
       </w:r>
-      <w:hyperlink r:id="rId51">
+      <w:hyperlink r:id="rId62">
         <w:r>
           <w:rPr>
             <w:rStyle w:val="Hyperlink"/>
@@ -36804,13 +36825,20 @@
         <w:pStyle w:val="BodyText"/>
       </w:pPr>
       <w:r>
-        <w:t xml:space="preserve">D. Taubman, A. Naman, M. Smith, P.-A. Lemieux, H. Saadat, O. Watanabe,</w:t>
-      </w:r>
-      <w:r>
-        <w:t xml:space="preserve"> </w:t>
-      </w:r>
-      <w:r>
-        <w:t xml:space="preserve">and R. Mathew,</w:t>
+        <w:t xml:space="preserve">D. Taubman</w:t>
+      </w:r>
+      <w:r>
+        <w:t xml:space="preserve"> </w:t>
+      </w:r>
+      <w:r>
+        <w:rPr>
+          <w:i/>
+          <w:iCs/>
+        </w:rPr>
+        <w:t xml:space="preserve">et al.</w:t>
+      </w:r>
+      <w:r>
+        <w:t xml:space="preserve">,</w:t>
       </w:r>
       <w:r>
         <w:t xml:space="preserve"> </w:t>
@@ -36987,7 +37015,7 @@
       <w:r>
         <w:t xml:space="preserve"> </w:t>
       </w:r>
-      <w:hyperlink r:id="rId52">
+      <w:hyperlink r:id="rId63">
         <w:r>
           <w:rPr>
             <w:rStyle w:val="Hyperlink"/>
@@ -37036,19 +37064,32 @@
         <w:pStyle w:val="BodyText"/>
       </w:pPr>
       <w:r>
-        <w:t xml:space="preserve">F. Giesen,</w:t>
-      </w:r>
-      <w:r>
-        <w:t xml:space="preserve"> </w:t>
-      </w:r>
-      <w:r>
-        <w:t xml:space="preserve">“Interleaved entropy coders,”</w:t>
-      </w:r>
-      <w:r>
-        <w:t xml:space="preserve"> </w:t>
-      </w:r>
-      <w:r>
-        <w:t xml:space="preserve">arXiv:1402.3392, 2014.</w:t>
+        <w:t xml:space="preserve">S. Mahapatra and K. Singh,</w:t>
+      </w:r>
+      <w:r>
+        <w:t xml:space="preserve"> </w:t>
+      </w:r>
+      <w:r>
+        <w:t xml:space="preserve">“An FPGA-based implementation of multi-alphabet arithmetic coding,”</w:t>
+      </w:r>
+      <w:r>
+        <w:t xml:space="preserve"> </w:t>
+      </w:r>
+      <w:r>
+        <w:rPr>
+          <w:i/>
+          <w:iCs/>
+        </w:rPr>
+        <w:t xml:space="preserve">IEEE Trans. Circuits Syst. I</w:t>
+      </w:r>
+      <w:r>
+        <w:t xml:space="preserve">, vol. 54, no. 8, pp. 1678–1686,</w:t>
+      </w:r>
+      <w:r>
+        <w:t xml:space="preserve"> </w:t>
+      </w:r>
+      <w:r>
+        <w:t xml:space="preserve">2007.</w:t>
       </w:r>
     </w:p>
     <w:p>
@@ -37056,6 +37097,26 @@
         <w:pStyle w:val="BodyText"/>
       </w:pPr>
       <w:r>
+        <w:t xml:space="preserve">F. Giesen,</w:t>
+      </w:r>
+      <w:r>
+        <w:t xml:space="preserve"> </w:t>
+      </w:r>
+      <w:r>
+        <w:t xml:space="preserve">“Interleaved entropy coders,”</w:t>
+      </w:r>
+      <w:r>
+        <w:t xml:space="preserve"> </w:t>
+      </w:r>
+      <w:r>
+        <w:t xml:space="preserve">arXiv:1402.3392, 2014.</w:t>
+      </w:r>
+    </w:p>
+    <w:p>
+      <w:pPr>
+        <w:pStyle w:val="BodyText"/>
+      </w:pPr>
+      <w:r>
         <w:t xml:space="preserve">F. Lin, K. Arunruangsirilert, H. Sun, and J. Katto,</w:t>
       </w:r>
       <w:r>
@@ -37286,7 +37347,7 @@
       <w:r>
         <w:t xml:space="preserve"> </w:t>
       </w:r>
-      <w:hyperlink r:id="rId53">
+      <w:hyperlink r:id="rId64">
         <w:r>
           <w:rPr>
             <w:rStyle w:val="Hyperlink"/>
@@ -37314,7 +37375,7 @@
       <w:r>
         <w:t xml:space="preserve"> </w:t>
       </w:r>
-      <w:hyperlink r:id="rId54">
+      <w:hyperlink r:id="rId65">
         <w:r>
           <w:rPr>
             <w:rStyle w:val="Hyperlink"/>
@@ -37348,7 +37409,7 @@
       <w:r>
         <w:t xml:space="preserve"> </w:t>
       </w:r>
-      <w:hyperlink r:id="rId55">
+      <w:hyperlink r:id="rId66">
         <w:r>
           <w:rPr>
             <w:rStyle w:val="Hyperlink"/>
@@ -37388,7 +37449,7 @@
       <w:r>
         <w:t xml:space="preserve"> </w:t>
       </w:r>
-      <w:hyperlink r:id="rId56">
+      <w:hyperlink r:id="rId67">
         <w:r>
           <w:rPr>
             <w:rStyle w:val="Hyperlink"/>
@@ -37422,7 +37483,7 @@
       <w:r>
         <w:t xml:space="preserve"> </w:t>
       </w:r>
-      <w:hyperlink r:id="rId57">
+      <w:hyperlink r:id="rId68">
         <w:r>
           <w:rPr>
             <w:rStyle w:val="Hyperlink"/>
@@ -37456,7 +37517,7 @@
       <w:r>
         <w:t xml:space="preserve"> </w:t>
       </w:r>
-      <w:hyperlink r:id="rId58">
+      <w:hyperlink r:id="rId69">
         <w:r>
           <w:rPr>
             <w:rStyle w:val="Hyperlink"/>
@@ -37559,7 +37620,7 @@
       <w:r>
         <w:t xml:space="preserve"> </w:t>
       </w:r>
-      <w:hyperlink r:id="rId59">
+      <w:hyperlink r:id="rId70">
         <w:r>
           <w:rPr>
             <w:rStyle w:val="Hyperlink"/>
@@ -37571,7 +37632,7 @@
         <w:t xml:space="preserve">.</w:t>
       </w:r>
     </w:p>
-    <w:bookmarkEnd w:id="60"/>
+    <w:bookmarkEnd w:id="71"/>
     <w:sectPr>
       <w:footnotePr>
         <w:numRestart w:val="eachSect"/>
@@ -37601,7 +37662,7 @@
       </w:r>
     </w:p>
   </w:footnote>
-  <w:footnote w:id="9">
+  <w:footnote w:id="20">
     <w:p>
       <w:pPr>
         <w:pStyle w:val="FootnoteText"/>
@@ -37639,7 +37700,7 @@
       <w:r>
         <w:t xml:space="preserve"> </w:t>
       </w:r>
-      <w:hyperlink r:id="rId10">
+      <w:hyperlink r:id="rId21">
         <w:r>
           <w:rPr>
             <w:rStyle w:val="Hyperlink"/>
@@ -37968,10 +38029,10 @@
   <w:docDefaults>
     <w:rPrDefault>
       <w:rPr>
-        <w:rFonts w:asciiTheme="minorHAnsi" w:cstheme="minorBidi" w:eastAsiaTheme="minorEastAsia" w:hAnsiTheme="minorHAnsi"/>
+        <w:rFonts w:asciiTheme="minorHAnsi" w:cstheme="minorBidi" w:eastAsiaTheme="minorHAnsi" w:hAnsiTheme="minorHAnsi"/>
         <w:sz w:val="24"/>
         <w:szCs w:val="24"/>
-        <w:lang w:bidi="ar-SA" w:eastAsia="zh-CN" w:val="en-US"/>
+        <w:lang w:bidi="ar-SA" w:eastAsia="en-US" w:val="en-US"/>
       </w:rPr>
     </w:rPrDefault>
     <w:pPrDefault>
@@ -38512,6 +38573,13 @@
       </w:tblCellMar>
     </w:tblPr>
     <w:tblStylePr w:type="firstRow">
+      <w:tblPr>
+        <w:jc w:val="left"/>
+        <w:tblInd w:type="dxa" w:w="0"/>
+      </w:tblPr>
+      <w:trPr>
+        <w:jc w:val="left"/>
+      </w:trPr>
       <w:tcPr>
         <w:tcBorders>
           <w:bottom w:val="single"/>

</xml_diff>